<commit_message>
Sincroniza documentacion y consolidados con la politica ON DELETE RESTRICT del equipo
A partir del commit 67584a4 (todas las FK a ON DELETE RESTRICT, sin borrado
fisico) se actualiza la documentacion que seguia describiendo CASCADE/SET NULL:

- Diccionario de datos (entrega + docs): 34 FK por archivo a (RESTRICT) y
  nota de convencion reescrita (politica de conservacion + soft delete via
  columnas deleted_at/removed_at/etc.).
- Normalizacion 2FN (entrega + docs): bloques SQL de ejemplo y checklist.
- Analisis de realidad (06 + 04 docs): linea de integridad referencial.
- Guia 2 (2.4 + docs): linea de integridad referencial.
- 3 consolidados (sql/schema/000, docs/000, entrega 08) regenerados desde los
  numerados via scripts/build_consolidado.py: 0 CASCADE, 43 RESTRICT.
- .docx de la entrega regenerados; 0 rastros de CASCADE/SET NULL.

Verificado: BD recrea limpia (50 tablas), consolidado ejecuta con
ON_ERROR_STOP=1 sin errores. Documentacion coherente con la implementacion.
</commit_message>
<xml_diff>
--- a/entrega_fase2/Evidencias Grupales/2.4_GuiaEstudiante_Fase2_DesarrolloProyecto_APT.docx
+++ b/entrega_fase2/Evidencias Grupales/2.4_GuiaEstudiante_Fase2_DesarrolloProyecto_APT.docx
@@ -1703,21 +1703,10 @@
           <w:color w:val="C7254E"/>
           <w:sz w:val="18"/>
         </w:rPr>
-        <w:t>ON DELETE CASCADE</w:t>
-      </w:r>
-      <w:r>
-        <w:t xml:space="preserve"> / </w:t>
-      </w:r>
-      <w:r>
-        <w:rPr>
-          <w:rFonts w:ascii="Consolas" w:hAnsi="Consolas"/>
-          <w:color w:val="C7254E"/>
-          <w:sz w:val="18"/>
-        </w:rPr>
-        <w:t>SET NULL</w:t>
-      </w:r>
-      <w:r>
-        <w:t xml:space="preserve">) e </w:t>
+        <w:t>ON DELETE RESTRICT</w:t>
+      </w:r>
+      <w:r>
+        <w:t xml:space="preserve">, sin borrado físico) e </w:t>
       </w:r>
       <w:r>
         <w:rPr>

</xml_diff>